<commit_message>
fix(docs): populate official company info (MST, Address, Hotline) in quote and contract templates
</commit_message>
<xml_diff>
--- a/input/BaoGia_Mau_PhucThanhAudio.docx
+++ b/input/BaoGia_Mau_PhucThanhAudio.docx
@@ -4,26 +4,18 @@
   <w:body>
     <w:p>
       <w:r>
-        <w:rPr>
-          <w:b/>
-          <w:i w:val="0"/>
-        </w:rPr>
-        <w:t>CÔNG TY TNHH THƯƠNG MẠI DỊCH VỤ PHÚC THANH</w:t>
+        <w:t>CÔNG TY TNHH THƯƠNG MẠI - DỊCH VỤ PHÚC THÀNH AN</w:t>
       </w:r>
     </w:p>
     <w:p>
       <w:r>
-        <w:rPr>
-          <w:b w:val="0"/>
-          <w:i w:val="0"/>
-        </w:rPr>
         <w:t>Thương hiệu: Phúc Thanh Audio Group / Siêu Thanh Audio</w:t>
         <w:br/>
-        <w:t>Địa chỉ: [để trống]</w:t>
+        <w:t>Địa chỉ: P.910, Tầng 9, Tòa nhà Mapletree Business Centre, 1060 Nguyễn Văn Linh, Phường Tân Hưng, TP Hồ Chí Minh</w:t>
         <w:br/>
-        <w:t>Mã số thuế: [để trống]</w:t>
+        <w:t>Mã số thuế: 0301719729</w:t>
         <w:br/>
-        <w:t>Hotline: [để trống]</w:t>
+        <w:t>Hotline: 0909 787 040 - 0934 635 766</w:t>
         <w:br/>
         <w:t>Email: phucthanhaudio@gmail.com</w:t>
         <w:br/>

</xml_diff>